<commit_message>
Check Artificial Intelligence Review for similar articles; cite and distinguish the five closest; refresh final files
Co-Authored-By: Claude Opus 5.5 <noreply@anthropic.com>
Claude-Session: https://claude.ai/code/session_01Mo5faDW38HYd76T4YfMx6p
</commit_message>
<xml_diff>
--- a/manuscript/final/manuscript.docx
+++ b/manuscript/final/manuscript.docx
@@ -326,7 +326,23 @@
         <w:t xml:space="preserve"> </w:t>
       </w:r>
       <w:r>
-        <w:t xml:space="preserve">is closest in theme, but synthesises fifteen landmark contributions published up to 2024 and predates the measurement literature on evaluation awareness (Maurya et al. 2026). Broad reviews of safety-evaluation methods and of reward hacking name sandbagging or evaluator gaming as challenges without synthesising how they are measured (Grey and Segerie 2025; Wang X et al. 2026; Morampudi et al. 2026). A recent hybrid survey frames benchmark validity and alignment failure as a common proxy–target divergence problem across eight evidence streams (Uluırmak and Kurban 2026), but it does not centre on model-originated threats or on how they are measured. Reviews of benchmark validity and safety datasets address the evaluator side of the problem rather than the model side (Röttger et al. 2025; Bean et al. 2025). Section 2.4 and Table 1 give the detailed comparison.</w:t>
+        <w:t xml:space="preserve">is closest in theme, but synthesises fifteen landmark contributions published up to 2024 and predates the measurement literature on evaluation awareness (Maurya et al. 2026). Broad reviews of safety-evaluation methods and of reward hacking name sandbagging or evaluator gaming as challenges without synthesising how they are measured (Grey and Segerie 2025; Wang X et al. 2026; Morampudi et al. 2026). A recent hybrid survey frames benchmark validity and alignment failure as a common proxy–target divergence problem across eight evidence streams (Uluırmak and Kurban 2026), but it does not centre on model-originated threats or on how they are measured. Reviews of benchmark validity and safety datasets address the evaluator side of the problem rather than the model side (Röttger et al. 2025; Bean et al. 2025). Recent reviews in</w:t>
+      </w:r>
+      <w:r>
+        <w:t xml:space="preserve"> </w:t>
+      </w:r>
+      <w:r>
+        <w:rPr>
+          <w:iCs/>
+          <w:i/>
+        </w:rPr>
+        <w:t xml:space="preserve">Artificial Intelligence Review</w:t>
+      </w:r>
+      <w:r>
+        <w:t xml:space="preserve"> </w:t>
+      </w:r>
+      <w:r>
+        <w:t xml:space="preserve">address adjacent problems: the validity of LLM-agent benchmarks as measurement instruments (Nageshwaran et al. 2026; Kehkashan et al. 2026), risks from deception and persuasion by LLMs (Jones and Bergen 2026), LLM-as-a-judge evaluation (Nadăş 2026) and epistemic norms for safety and alignment research (Navaie 2026). Judged from their abstracts, none treats the evaluated model’s own recognition of evaluation as a threat to the validity of scores. Section 2.4 and Table 1 give the detailed comparison.</w:t>
       </w:r>
     </w:p>
     <w:p>
@@ -1433,6 +1449,174 @@
             </w:pPr>
             <w:r>
               <w:t xml:space="preserve">Reward hacking treated as one evaluator-gaming pathway within a validity framework</w:t>
+            </w:r>
+          </w:p>
+        </w:tc>
+      </w:tr>
+      <w:tr>
+        <w:tc>
+          <w:tcPr/>
+          <w:p>
+            <w:pPr>
+              <w:pStyle w:val="Compact"/>
+              <w:jc w:val="left"/>
+            </w:pPr>
+            <w:r>
+              <w:t xml:space="preserve">Nageshwaran et al. (2026)</w:t>
+            </w:r>
+          </w:p>
+        </w:tc>
+        <w:tc>
+          <w:tcPr/>
+          <w:p>
+            <w:pPr>
+              <w:pStyle w:val="Compact"/>
+              <w:jc w:val="left"/>
+            </w:pPr>
+            <w:r>
+              <w:t xml:space="preserve">Systematic mapping review (PRISMA-ScR; 259 studies),</w:t>
+            </w:r>
+            <w:r>
+              <w:t xml:space="preserve"> </w:t>
+            </w:r>
+            <w:r>
+              <w:rPr>
+                <w:iCs/>
+                <w:i/>
+              </w:rPr>
+              <w:t xml:space="preserve">Artificial Intelligence Review</w:t>
+            </w:r>
+          </w:p>
+        </w:tc>
+        <w:tc>
+          <w:tcPr/>
+          <w:p>
+            <w:pPr>
+              <w:pStyle w:val="Compact"/>
+              <w:jc w:val="left"/>
+            </w:pPr>
+            <w:r>
+              <w:t xml:space="preserve">Validity of LLM-agent benchmarks: capability, scoring and environment</w:t>
+            </w:r>
+          </w:p>
+        </w:tc>
+        <w:tc>
+          <w:tcPr/>
+          <w:p>
+            <w:pPr>
+              <w:pStyle w:val="Compact"/>
+              <w:jc w:val="left"/>
+            </w:pPr>
+            <w:r>
+              <w:t xml:space="preserve">Not a focus (evaluator-side validity)</w:t>
+            </w:r>
+          </w:p>
+        </w:tc>
+        <w:tc>
+          <w:tcPr/>
+          <w:p>
+            <w:pPr>
+              <w:pStyle w:val="Compact"/>
+              <w:jc w:val="left"/>
+            </w:pPr>
+            <w:r>
+              <w:t xml:space="preserve">Benchmark design and scoring</w:t>
+            </w:r>
+          </w:p>
+        </w:tc>
+        <w:tc>
+          <w:tcPr/>
+          <w:p>
+            <w:pPr>
+              <w:pStyle w:val="Compact"/>
+              <w:jc w:val="left"/>
+            </w:pPr>
+            <w:r>
+              <w:t xml:space="preserve">Model-originated threats; complements its evaluator-side analysis</w:t>
+            </w:r>
+          </w:p>
+        </w:tc>
+      </w:tr>
+      <w:tr>
+        <w:tc>
+          <w:tcPr/>
+          <w:p>
+            <w:pPr>
+              <w:pStyle w:val="Compact"/>
+              <w:jc w:val="left"/>
+            </w:pPr>
+            <w:r>
+              <w:t xml:space="preserve">Jones and Bergen (2026)</w:t>
+            </w:r>
+          </w:p>
+        </w:tc>
+        <w:tc>
+          <w:tcPr/>
+          <w:p>
+            <w:pPr>
+              <w:pStyle w:val="Compact"/>
+              <w:jc w:val="left"/>
+            </w:pPr>
+            <w:r>
+              <w:t xml:space="preserve">Review,</w:t>
+            </w:r>
+            <w:r>
+              <w:t xml:space="preserve"> </w:t>
+            </w:r>
+            <w:r>
+              <w:rPr>
+                <w:iCs/>
+                <w:i/>
+              </w:rPr>
+              <w:t xml:space="preserve">Artificial Intelligence Review</w:t>
+            </w:r>
+          </w:p>
+        </w:tc>
+        <w:tc>
+          <w:tcPr/>
+          <w:p>
+            <w:pPr>
+              <w:pStyle w:val="Compact"/>
+              <w:jc w:val="left"/>
+            </w:pPr>
+            <w:r>
+              <w:t xml:space="preserve">Risks from manipulation, persuasion and deception by LLMs</w:t>
+            </w:r>
+          </w:p>
+        </w:tc>
+        <w:tc>
+          <w:tcPr/>
+          <w:p>
+            <w:pPr>
+              <w:pStyle w:val="Compact"/>
+              <w:jc w:val="left"/>
+            </w:pPr>
+            <w:r>
+              <w:t xml:space="preserve">Not a focus</w:t>
+            </w:r>
+          </w:p>
+        </w:tc>
+        <w:tc>
+          <w:tcPr/>
+          <w:p>
+            <w:pPr>
+              <w:pStyle w:val="Compact"/>
+              <w:jc w:val="left"/>
+            </w:pPr>
+            <w:r>
+              <w:t xml:space="preserve">No</w:t>
+            </w:r>
+          </w:p>
+        </w:tc>
+        <w:tc>
+          <w:tcPr/>
+          <w:p>
+            <w:pPr>
+              <w:pStyle w:val="Compact"/>
+              <w:jc w:val="left"/>
+            </w:pPr>
+            <w:r>
+              <w:t xml:space="preserve">Deception and awareness as threats to evaluation validity; measurement-method synthesis</w:t>
             </w:r>
           </w:p>
         </w:tc>
@@ -11520,7 +11704,7 @@
         <w:t xml:space="preserve"> </w:t>
       </w:r>
       <w:r>
-        <w:t xml:space="preserve">by Maurya et al. (2026), which discusses fifteen landmark contributions up to 2024, it adds a reproducible multi-database search, the 2025–2026 measurement literature and an explicit separation of awareness from behaviour. Relative to the broad proxy–target framing of Uluırmak and Kurban (2026), it isolates the model-originated mechanisms and their measurement. Relative to construct-validity reviews of benchmarks (Bean et al. 2025; Reuel et al. 2024), it adds a class of threat that remains even when a benchmark is well designed, although the benchmark audits in Section 4.9 show that many agent benchmarks are not. A benchmark with strong construct validity can still yield invalid inferences if the evaluated system behaves differently because it recognises the benchmark.</w:t>
+        <w:t xml:space="preserve">by Maurya et al. (2026), which discusses fifteen landmark contributions up to 2024, it adds a reproducible multi-database search, the 2025–2026 measurement literature and an explicit separation of awareness from behaviour. Relative to the broad proxy–target framing of Uluırmak and Kurban (2026), it isolates the model-originated mechanisms and their measurement. Relative to construct-validity reviews of benchmarks (Bean et al. 2025; Reuel et al. 2024) and to the validity-centred survey of agent benchmarks by Nageshwaran et al. (2026), it adds a class of threat that remains even when a benchmark is well designed, although the benchmark audits in Section 4.9 show that many agent benchmarks are not. A benchmark with strong construct validity can still yield invalid inferences if the evaluated system behaves differently because it recognises the benchmark.</w:t>
       </w:r>
     </w:p>
     <w:bookmarkEnd w:id="60"/>
@@ -13949,6 +14133,14 @@
         <w:pStyle w:val="BodyText"/>
       </w:pPr>
       <w:r>
+        <w:t xml:space="preserve">Jones C, Bergen B (2026) Lies, damned lies, and language statistics: a comprehensive review of risks from manipulation, persuasion, and deception with large language models. Artif Intell Rev 59(4):116. https://doi.org/10.1007/s10462-026-11517-6</w:t>
+      </w:r>
+    </w:p>
+    <w:p>
+      <w:pPr>
+        <w:pStyle w:val="BodyText"/>
+      </w:pPr>
+      <w:r>
         <w:t xml:space="preserve">Karvonen A, Chua J, Dumas C et al. (2026) Activation oracles: training and evaluating LLMs as general-purpose activation explainers. In: Proceedings of the 43rd International Conference on Machine Learning (ICML 2026). arXiv preprint arXiv:2512.15674. https://arxiv.org/abs/2512.15674</w:t>
       </w:r>
     </w:p>
@@ -13965,6 +14157,14 @@
         <w:pStyle w:val="BodyText"/>
       </w:pPr>
       <w:r>
+        <w:t xml:space="preserve">Kehkashan T, Abdullah M, Al-Shamayleh AS et al. (2026) From benchmarks to deployment: a comprehensive review of agentic AI evaluation. Artif Intell Rev 59(8):167. https://doi.org/10.1007/s10462-026-11571-0</w:t>
+      </w:r>
+    </w:p>
+    <w:p>
+      <w:pPr>
+        <w:pStyle w:val="BodyText"/>
+      </w:pPr>
+      <w:r>
         <w:t xml:space="preserve">Kirk R, Souly A, Fronsdal K, D’Cruz A, Davies X (2026) Evaluating whether AI models would sabotage AI safety research. arXiv preprint arXiv:2604.24618. https://arxiv.org/abs/2604.24618</w:t>
       </w:r>
     </w:p>
@@ -14294,6 +14494,30 @@
       </w:pPr>
       <w:r>
         <w:t xml:space="preserve">Motwani SR, Baranchuk M, Strohmeier M et al. (2024) Secret collusion among AI agents: multi-agent deception via steganography. In: Advances in Neural Information Processing Systems 37 (NeurIPS 2024). arXiv preprint arXiv:2402.07510. https://arxiv.org/abs/2402.07510</w:t>
+      </w:r>
+    </w:p>
+    <w:p>
+      <w:pPr>
+        <w:pStyle w:val="BodyText"/>
+      </w:pPr>
+      <w:r>
+        <w:t xml:space="preserve">Nadăş MD (2026) Large language models as judges: recent advances in LLM-based evaluation, critique, preference modeling, and feedback for text and code. Artif Intell Rev. https://doi.org/10.1007/s10462-026-11652-0</w:t>
+      </w:r>
+    </w:p>
+    <w:p>
+      <w:pPr>
+        <w:pStyle w:val="BodyText"/>
+      </w:pPr>
+      <w:r>
+        <w:t xml:space="preserve">Nageshwaran V, Ezekiel S, Tran TT, Lakshmi Narasimhan V (2026) Large language model agent evaluation and benchmarking: a systematic survey, meta-taxonomy, and critical research roadmap. Artif Intell Rev. https://doi.org/10.1007/s10462-026-11678-4</w:t>
+      </w:r>
+    </w:p>
+    <w:p>
+      <w:pPr>
+        <w:pStyle w:val="BodyText"/>
+      </w:pPr>
+      <w:r>
+        <w:t xml:space="preserve">Navaie K (2026) Epistemic norms for AI safety and alignment research. Artif Intell Rev. https://doi.org/10.1007/s10462-026-11666-8</w:t>
       </w:r>
     </w:p>
     <w:p>

</xml_diff>